<commit_message>
docs: sebut endpoint cek pembaruan dengan tepat, dan daftarkan bake-off di ml/README
Paket kepatuhan menulis "repositori rilis" untuk titik keluar jaringan
nomor 3. Auditor yang memeriksa sendiri tidak bisa berbuat apa-apa dengan
kalimat itu; yang sebenarnya terjadi adalah satu GET berkas `VERSION` ke
raw.githubusercontent.com (lib/app_version.dart:24). Disebutkan apa
adanya, berikut nomor barisnya.

ml/README.md belum menyebut notulen_bench/ maupun NOTULEN-BENCHMARK.md di
tabel tata letaknya.
</commit_message>
<xml_diff>
--- a/docs/compliance/docx/ALUR-DATA.docx
+++ b/docs/compliance/docx/ALUR-DATA.docx
@@ -2706,9 +2706,42 @@
             </w:pPr>
             <w:r>
               <w:rPr>
+                <w:rFonts w:ascii="Consolas" w:hAnsi="Consolas"/>
                 <w:sz w:val="18"/>
               </w:rPr>
-              <w:t>repositori rilis</w:t>
+              <w:t>raw.githubusercontent.com</w:t>
+            </w:r>
+            <w:r>
+              <w:rPr>
+                <w:sz w:val="18"/>
+              </w:rPr>
+              <w:t xml:space="preserve"> — satu berkas </w:t>
+            </w:r>
+            <w:r>
+              <w:rPr>
+                <w:rFonts w:ascii="Consolas" w:hAnsi="Consolas"/>
+                <w:sz w:val="18"/>
+              </w:rPr>
+              <w:t>VERSION</w:t>
+            </w:r>
+            <w:r>
+              <w:rPr>
+                <w:sz w:val="18"/>
+              </w:rPr>
+              <w:t xml:space="preserve"> (</w:t>
+            </w:r>
+            <w:r>
+              <w:rPr>
+                <w:rFonts w:ascii="Consolas" w:hAnsi="Consolas"/>
+                <w:sz w:val="18"/>
+              </w:rPr>
+              <w:t>lib/app_version.dart:24</w:t>
+            </w:r>
+            <w:r>
+              <w:rPr>
+                <w:sz w:val="18"/>
+              </w:rPr>
+              <w:t>)</w:t>
             </w:r>
           </w:p>
         </w:tc>
@@ -2747,7 +2780,7 @@
               <w:rPr>
                 <w:sz w:val="18"/>
               </w:rPr>
-              <w:t xml:space="preserve"> GET metadata versi</w:t>
+              <w:t xml:space="preserve"> GET satu berkas teks berisi nomor versi</w:t>
             </w:r>
           </w:p>
         </w:tc>

</xml_diff>

<commit_message>
docs(compliance): jelaskan mengapa Laporan Privasi menyebut empat titik keluar
ALUR-DATA.md mendaftar lima titik keluar jaringan; layar Laporan Privasi
di dalam aplikasi menyebut empat. Keduanya benar -- layar melipat
pertanyaan arsip ke baris endpoint ringkasan karena endpointnya memang
sama -- tetapi auditor yang membandingkan dokumen dengan layar akan
mengira ada satu yang disembunyikan. Selisihnya dijelaskan di tempat
selisih itu terlihat.
</commit_message>
<xml_diff>
--- a/docs/compliance/docx/ALUR-DATA.docx
+++ b/docs/compliance/docx/ALUR-DATA.docx
@@ -3027,6 +3027,26 @@
     </w:p>
     <w:p>
       <w:pPr>
+        <w:spacing w:before="120" w:after="120"/>
+        <w:ind w:left="480"/>
+      </w:pPr>
+      <w:r>
+        <w:rPr>
+          <w:b/>
+          <w:sz w:val="20"/>
+        </w:rPr>
+        <w:t>Mengapa layar Laporan Privasi menyebut *empat*, bukan lima.</w:t>
+      </w:r>
+      <w:r>
+        <w:rPr>
+          <w:i/>
+          <w:sz w:val="20"/>
+        </w:rPr>
+        <w:t xml:space="preserve"> Layar di dalam aplikasi melipat baris 5 ke dalam baris 2, karena keduanya adalah endpoint yang sama dan pengguna mengaturnya di satu tempat. Tabel ini memisahkannya karena pemicunya berbeda — satu dari tombol "Buat Ringkasan/Notulen", satu dari "Tanya arsip rapat" — dan asesmen perlu tahu keduanya. Tidak ada titik keluar yang hilang dari salah satu daftar.</w:t>
+      </w:r>
+    </w:p>
+    <w:p>
+      <w:pPr>
         <w:pStyle w:val="Heading3"/>
       </w:pPr>
       <w:r>

</xml_diff>